<commit_message>
Quitar apartado de seguros del acta de entrevista
</commit_message>
<xml_diff>
--- a/siniestros/plantillas/entrevista.docx
+++ b/siniestros/plantillas/entrevista.docx
@@ -644,85 +644,12 @@
               <w:tblLook w:val="04A0" w:firstRow="1" w:lastRow="0" w:firstColumn="1" w:lastColumn="0" w:noHBand="0" w:noVBand="1"/>
             </w:tblPr>
             <w:tblGrid>
-              <w:gridCol w:w="2618"/>
-              <w:gridCol w:w="2618"/>
-              <w:gridCol w:w="2619"/>
-              <w:gridCol w:w="2619"/>
+              <w:gridCol w:w="10474"/>
             </w:tblGrid>
             <w:tr>
               <w:tc>
                 <w:tcPr>
-                  <w:tcW w:w="2618" w:type="dxa"/>
-                </w:tcPr>
-                <w:p>
-                  <w:pPr>
-                    <w:pStyle w:val="TableParagraph"/>
-                    <w:framePr w:hSpace="141" w:wrap="around" w:vAnchor="text" w:hAnchor="text" w:y="1"/>
-                    <w:spacing w:before="132"/>
-                    <w:suppressOverlap/>
-                    <w:rPr>
-                      <w:sz w:val="16"/>
-                      <w:szCs w:val="16"/>
-                    </w:rPr>
-                  </w:pPr>
-                  <w:r>
-                    <w:rPr>
-                      <w:sz w:val="16"/>
-                      <w:szCs w:val="16"/>
-                    </w:rPr>
-                    <w:t>SE ACTIVA EL SEGURO:</w:t>
-                  </w:r>
-                </w:p>
-                <w:p>
-                  <w:pPr>
-                    <w:pStyle w:val="TableParagraph"/>
-                    <w:framePr w:hSpace="141" w:wrap="around" w:vAnchor="text" w:hAnchor="text" w:y="1"/>
-                    <w:spacing w:before="132"/>
-                    <w:suppressOverlap/>
-                    <w:rPr>
-                      <w:sz w:val="16"/>
-                      <w:szCs w:val="16"/>
-                    </w:rPr>
-                  </w:pPr>
-                </w:p>
-                <w:p>
-                  <w:r>
-                    <w:t>{{ seguro_activo }}</w:t>
-                  </w:r>
-                </w:p>
-              </w:tc>
-              <w:tc>
-                <w:tcPr>
-                  <w:tcW w:w="2618" w:type="dxa"/>
-                </w:tcPr>
-                <w:p>
-                  <w:pPr>
-                    <w:pStyle w:val="TableParagraph"/>
-                    <w:framePr w:hSpace="141" w:wrap="around" w:vAnchor="text" w:hAnchor="text" w:y="1"/>
-                    <w:spacing w:before="132"/>
-                    <w:suppressOverlap/>
-                    <w:rPr>
-                      <w:sz w:val="16"/>
-                      <w:szCs w:val="16"/>
-                    </w:rPr>
-                  </w:pPr>
-                  <w:r>
-                    <w:rPr>
-                      <w:sz w:val="16"/>
-                      <w:szCs w:val="16"/>
-                    </w:rPr>
-                    <w:t>PASES MEDICOS:</w:t>
-                  </w:r>
-                </w:p>
-                <w:p>
-                  <w:r>
-                    <w:t>{{ pases_medicos }}</w:t>
-                  </w:r>
-                </w:p>
-              </w:tc>
-              <w:tc>
-                <w:tcPr>
-                  <w:tcW w:w="2619" w:type="dxa"/>
+                  <w:tcW w:w="10474" w:type="dxa"/>
                 </w:tcPr>
                 <w:p>
                   <w:pPr>
@@ -746,35 +673,6 @@
                 <w:p>
                   <w:r>
                     <w:t>{{ causal }}</w:t>
-                  </w:r>
-                </w:p>
-              </w:tc>
-              <w:tc>
-                <w:tcPr>
-                  <w:tcW w:w="2619" w:type="dxa"/>
-                </w:tcPr>
-                <w:p>
-                  <w:pPr>
-                    <w:pStyle w:val="TableParagraph"/>
-                    <w:framePr w:hSpace="141" w:wrap="around" w:vAnchor="text" w:hAnchor="text" w:y="1"/>
-                    <w:spacing w:before="132"/>
-                    <w:suppressOverlap/>
-                    <w:rPr>
-                      <w:sz w:val="16"/>
-                      <w:szCs w:val="16"/>
-                    </w:rPr>
-                  </w:pPr>
-                  <w:r>
-                    <w:rPr>
-                      <w:sz w:val="16"/>
-                      <w:szCs w:val="16"/>
-                    </w:rPr>
-                    <w:t>SEGURO QUE GARANTIZA:</w:t>
-                  </w:r>
-                </w:p>
-                <w:p>
-                  <w:r>
-                    <w:t>{{ seguro_garantiza }}</w:t>
                   </w:r>
                 </w:p>
               </w:tc>

</xml_diff>